<commit_message>
Add flexible habits shields and ongoing cashouts
</commit_message>
<xml_diff>
--- a/Kudos Master Rule book.docx
+++ b/Kudos Master Rule book.docx
@@ -14,6 +14,7 @@
           <w:rFonts w:ascii="Segoe UI Emoji" w:hAnsi="Segoe UI Emoji" w:cs="Segoe UI Emoji"/>
           <w:b/>
           <w:bCs/>
+          <w:noProof/>
         </w:rPr>
         <w:drawing>
           <wp:inline distT="0" distB="0" distL="0" distR="0" wp14:anchorId="7612BE22" wp14:editId="21533B2E">
@@ -89,7 +90,7 @@
     <w:p>
       <w:r>
         <w:pict w14:anchorId="48A7DDD9">
-          <v:rect id="_x0000_i1109" style="width:0;height:1.5pt" o:hralign="center" o:hrstd="t" o:hr="t" fillcolor="#a0a0a0" stroked="f"/>
+          <v:rect id="_x0000_i1025" style="width:0;height:1.5pt" o:hralign="center" o:hrstd="t" o:hr="t" fillcolor="#a0a0a0" stroked="f"/>
         </w:pict>
       </w:r>
     </w:p>
@@ -140,13 +141,21 @@
     </w:p>
     <w:p>
       <w:r>
-        <w:t>Everyone plays. Parents earn and lose stars on exactly the same rules as the kids.</w:t>
+        <w:t xml:space="preserve">Everyone plays. Parents earn and lose stars on </w:t>
+      </w:r>
+      <w:proofErr w:type="gramStart"/>
+      <w:r>
+        <w:t>exactly the same</w:t>
+      </w:r>
+      <w:proofErr w:type="gramEnd"/>
+      <w:r>
+        <w:t xml:space="preserve"> rules as the kids.</w:t>
       </w:r>
     </w:p>
     <w:p>
       <w:r>
         <w:pict w14:anchorId="6AF6BCB9">
-          <v:rect id="_x0000_i1110" style="width:0;height:1.5pt" o:hralign="center" o:hrstd="t" o:hr="t" fillcolor="#a0a0a0" stroked="f"/>
+          <v:rect id="_x0000_i1026" style="width:0;height:1.5pt" o:hralign="center" o:hrstd="t" o:hr="t" fillcolor="#a0a0a0" stroked="f"/>
         </w:pict>
       </w:r>
     </w:p>
@@ -549,7 +558,7 @@
     <w:p>
       <w:r>
         <w:pict w14:anchorId="16B2FED2">
-          <v:rect id="_x0000_i1111" style="width:0;height:1.5pt" o:hralign="center" o:hrstd="t" o:hr="t" fillcolor="#a0a0a0" stroked="f"/>
+          <v:rect id="_x0000_i1027" style="width:0;height:1.5pt" o:hralign="center" o:hrstd="t" o:hr="t" fillcolor="#a0a0a0" stroked="f"/>
         </w:pict>
       </w:r>
     </w:p>
@@ -1664,8 +1673,13 @@
             <w:hideMark/>
           </w:tcPr>
           <w:p>
-            <w:r>
-              <w:t>Maths practice 20 min</w:t>
+            <w:proofErr w:type="spellStart"/>
+            <w:r>
+              <w:t>Maths</w:t>
+            </w:r>
+            <w:proofErr w:type="spellEnd"/>
+            <w:r>
+              <w:t xml:space="preserve"> practice 20 min</w:t>
             </w:r>
           </w:p>
         </w:tc>
@@ -1706,8 +1720,13 @@
           </w:tcPr>
           <w:p>
             <w:r>
-              <w:t>TV/screens under 1 hr</w:t>
-            </w:r>
+              <w:t xml:space="preserve">TV/screens under 1 </w:t>
+            </w:r>
+            <w:proofErr w:type="spellStart"/>
+            <w:r>
+              <w:t>hr</w:t>
+            </w:r>
+            <w:proofErr w:type="spellEnd"/>
           </w:p>
         </w:tc>
         <w:tc>
@@ -1894,7 +1913,15 @@
         <w:t>Max 5 active habits.</w:t>
       </w:r>
       <w:r>
-        <w:t xml:space="preserve"> Five things done consistently beats ten things done never.</w:t>
+        <w:t xml:space="preserve"> Five things done consistently </w:t>
+      </w:r>
+      <w:proofErr w:type="gramStart"/>
+      <w:r>
+        <w:t>beats</w:t>
+      </w:r>
+      <w:proofErr w:type="gramEnd"/>
+      <w:r>
+        <w:t xml:space="preserve"> ten things done never.</w:t>
       </w:r>
     </w:p>
     <w:p>
@@ -1931,7 +1958,7 @@
     <w:p>
       <w:r>
         <w:pict w14:anchorId="6BE66A45">
-          <v:rect id="_x0000_i1112" style="width:0;height:1.5pt" o:hralign="center" o:hrstd="t" o:hr="t" fillcolor="#a0a0a0" stroked="f"/>
+          <v:rect id="_x0000_i1028" style="width:0;height:1.5pt" o:hralign="center" o:hrstd="t" o:hr="t" fillcolor="#a0a0a0" stroked="f"/>
         </w:pict>
       </w:r>
     </w:p>
@@ -2158,7 +2185,15 @@
         </w:numPr>
       </w:pPr>
       <w:r>
-        <w:t xml:space="preserve">No cap on how many you can </w:t>
+        <w:t xml:space="preserve">No cap on how </w:t>
+      </w:r>
+      <w:proofErr w:type="gramStart"/>
+      <w:r>
+        <w:t>many</w:t>
+      </w:r>
+      <w:proofErr w:type="gramEnd"/>
+      <w:r>
+        <w:t xml:space="preserve"> you can </w:t>
       </w:r>
       <w:r>
         <w:rPr>
@@ -2189,13 +2224,21 @@
         </w:numPr>
       </w:pPr>
       <w:r>
-        <w:t>Trading nominations ("I'll nominate you if you nominate me") voids both.</w:t>
+        <w:t xml:space="preserve">Trading nominations ("I'll nominate you if you nominate me") </w:t>
+      </w:r>
+      <w:proofErr w:type="gramStart"/>
+      <w:r>
+        <w:t>voids</w:t>
+      </w:r>
+      <w:proofErr w:type="gramEnd"/>
+      <w:r>
+        <w:t xml:space="preserve"> both.</w:t>
       </w:r>
     </w:p>
     <w:p>
       <w:r>
         <w:pict w14:anchorId="517C36D9">
-          <v:rect id="_x0000_i1114" style="width:0;height:1.5pt" o:hralign="center" o:hrstd="t" o:hr="t" fillcolor="#a0a0a0" stroked="f"/>
+          <v:rect id="_x0000_i1029" style="width:0;height:1.5pt" o:hralign="center" o:hrstd="t" o:hr="t" fillcolor="#a0a0a0" stroked="f"/>
         </w:pict>
       </w:r>
     </w:p>
@@ -2583,6 +2626,13 @@
         </w:rPr>
         <w:t xml:space="preserve"> Streak Shields</w:t>
       </w:r>
+      <w:r>
+        <w:rPr>
+          <w:b/>
+          <w:bCs/>
+        </w:rPr>
+        <w:t xml:space="preserve"> </w:t>
+      </w:r>
     </w:p>
     <w:p>
       <w:r>
@@ -2593,7 +2643,14 @@
           <w:b/>
           <w:bCs/>
         </w:rPr>
-        <w:t>one Shield per quarter</w:t>
+        <w:t>two</w:t>
+      </w:r>
+      <w:r>
+        <w:rPr>
+          <w:b/>
+          <w:bCs/>
+        </w:rPr>
+        <w:t xml:space="preserve"> Shield per quarter</w:t>
       </w:r>
       <w:r>
         <w:t xml:space="preserve"> (4 per year). Playing a Shield protects your streak through one missed week.</w:t>
@@ -2608,7 +2665,7 @@
     <w:p>
       <w:r>
         <w:pict w14:anchorId="2550FFE5">
-          <v:rect id="_x0000_i1115" style="width:0;height:1.5pt" o:hralign="center" o:hrstd="t" o:hr="t" fillcolor="#a0a0a0" stroked="f"/>
+          <v:rect id="_x0000_i1030" style="width:0;height:1.5pt" o:hralign="center" o:hrstd="t" o:hr="t" fillcolor="#a0a0a0" stroked="f"/>
         </w:pict>
       </w:r>
     </w:p>
@@ -2629,13 +2686,21 @@
     </w:p>
     <w:p>
       <w:r>
-        <w:t>You lose stars only at parents discretion if both parents agree and for really bad behavior</w:t>
+        <w:t xml:space="preserve">You lose stars only at </w:t>
+      </w:r>
+      <w:proofErr w:type="gramStart"/>
+      <w:r>
+        <w:t>parents</w:t>
+      </w:r>
+      <w:proofErr w:type="gramEnd"/>
+      <w:r>
+        <w:t xml:space="preserve"> discretion if both parents agree and for really bad behavior</w:t>
       </w:r>
     </w:p>
     <w:p>
       <w:r>
         <w:pict w14:anchorId="2F75CA10">
-          <v:rect id="_x0000_i1116" style="width:0;height:1.5pt" o:hralign="center" o:hrstd="t" o:hr="t" fillcolor="#a0a0a0" stroked="f"/>
+          <v:rect id="_x0000_i1031" style="width:0;height:1.5pt" o:hralign="center" o:hrstd="t" o:hr="t" fillcolor="#a0a0a0" stroked="f"/>
         </w:pict>
       </w:r>
     </w:p>
@@ -2656,7 +2721,15 @@
     </w:p>
     <w:p>
       <w:r>
-        <w:t>Written in advance so nobody has to argue about it later.</w:t>
+        <w:t xml:space="preserve">Written in advance so nobody </w:t>
+      </w:r>
+      <w:proofErr w:type="gramStart"/>
+      <w:r>
+        <w:t>has to</w:t>
+      </w:r>
+      <w:proofErr w:type="gramEnd"/>
+      <w:r>
+        <w:t xml:space="preserve"> argue about it later.</w:t>
       </w:r>
     </w:p>
     <w:p>
@@ -2781,7 +2854,7 @@
     <w:p>
       <w:r>
         <w:pict w14:anchorId="54D5816E">
-          <v:rect id="_x0000_i1117" style="width:0;height:1.5pt" o:hralign="center" o:hrstd="t" o:hr="t" fillcolor="#a0a0a0" stroked="f"/>
+          <v:rect id="_x0000_i1032" style="width:0;height:1.5pt" o:hralign="center" o:hrstd="t" o:hr="t" fillcolor="#a0a0a0" stroked="f"/>
         </w:pict>
       </w:r>
     </w:p>
@@ -2939,7 +3012,7 @@
     <w:p>
       <w:r>
         <w:pict w14:anchorId="1DD34CF4">
-          <v:rect id="_x0000_i1118" style="width:0;height:1.5pt" o:hralign="center" o:hrstd="t" o:hr="t" fillcolor="#a0a0a0" stroked="f"/>
+          <v:rect id="_x0000_i1033" style="width:0;height:1.5pt" o:hralign="center" o:hrstd="t" o:hr="t" fillcolor="#a0a0a0" stroked="f"/>
         </w:pict>
       </w:r>
     </w:p>
@@ -2960,7 +3033,15 @@
     </w:p>
     <w:p>
       <w:r>
-        <w:t>Kudos is meant to be edited. It will be wrong in places and you'll only find out by playing it.</w:t>
+        <w:t xml:space="preserve">Kudos is meant to be edited. It will be wrong in </w:t>
+      </w:r>
+      <w:proofErr w:type="gramStart"/>
+      <w:r>
+        <w:t>places</w:t>
+      </w:r>
+      <w:proofErr w:type="gramEnd"/>
+      <w:r>
+        <w:t xml:space="preserve"> and you'll only find out by playing it.</w:t>
       </w:r>
     </w:p>
     <w:p>
@@ -2978,7 +3059,15 @@
         <w:t>Anyone</w:t>
       </w:r>
       <w:r>
-        <w:t xml:space="preserve"> can propose an amendment at a huddle — including Kashi, including on a rule a parent wrote.</w:t>
+        <w:t xml:space="preserve"> can propose an amendment at a huddle — including Kashi, </w:t>
+      </w:r>
+      <w:proofErr w:type="gramStart"/>
+      <w:r>
+        <w:t>including on</w:t>
+      </w:r>
+      <w:proofErr w:type="gramEnd"/>
+      <w:r>
+        <w:t xml:space="preserve"> a rule a parent wrote.</w:t>
       </w:r>
     </w:p>
     <w:p>
@@ -3075,7 +3164,7 @@
     <w:p>
       <w:r>
         <w:pict w14:anchorId="4E3BE702">
-          <v:rect id="_x0000_i1119" style="width:0;height:1.5pt" o:hralign="center" o:hrstd="t" o:hr="t" fillcolor="#a0a0a0" stroked="f"/>
+          <v:rect id="_x0000_i1034" style="width:0;height:1.5pt" o:hralign="center" o:hrstd="t" o:hr="t" fillcolor="#a0a0a0" stroked="f"/>
         </w:pict>
       </w:r>
     </w:p>
@@ -3102,6 +3191,7 @@
         </w:rPr>
         <w:t xml:space="preserve">Season 1 runs from the first huddle through </w:t>
       </w:r>
+      <w:proofErr w:type="spellStart"/>
       <w:r>
         <w:rPr>
           <w:b/>
@@ -3109,6 +3199,7 @@
         </w:rPr>
         <w:t>Dewali</w:t>
       </w:r>
+      <w:proofErr w:type="spellEnd"/>
       <w:r>
         <w:rPr>
           <w:b/>
@@ -3398,7 +3489,7 @@
     <w:p>
       <w:r>
         <w:pict w14:anchorId="6B1A24AC">
-          <v:rect id="_x0000_i1120" style="width:0;height:1.5pt" o:hralign="center" o:hrstd="t" o:hr="t" fillcolor="#a0a0a0" stroked="f"/>
+          <v:rect id="_x0000_i1035" style="width:0;height:1.5pt" o:hralign="center" o:hrstd="t" o:hr="t" fillcolor="#a0a0a0" stroked="f"/>
         </w:pict>
       </w:r>
     </w:p>
@@ -3623,7 +3714,7 @@
     <w:p>
       <w:r>
         <w:pict w14:anchorId="7496DEEA">
-          <v:rect id="_x0000_i1122" style="width:0;height:1.5pt" o:hralign="center" o:hrstd="t" o:hr="t" fillcolor="#a0a0a0" stroked="f"/>
+          <v:rect id="_x0000_i1036" style="width:0;height:1.5pt" o:hralign="center" o:hrstd="t" o:hr="t" fillcolor="#a0a0a0" stroked="f"/>
         </w:pict>
       </w:r>
     </w:p>
@@ -5675,6 +5766,7 @@
   <w:style w:type="character" w:default="1" w:styleId="DefaultParagraphFont">
     <w:name w:val="Default Paragraph Font"/>
     <w:uiPriority w:val="1"/>
+    <w:semiHidden/>
     <w:unhideWhenUsed/>
   </w:style>
   <w:style w:type="table" w:default="1" w:styleId="TableNormal">

</xml_diff>